<commit_message>
Add openFDA MCP server — FDA open data as callable tools (the 'tool' tier)
- mcp-servers/openfda/server.py: FastMCP stdio server, stdlib-only HTTP, tools for
  recalls/enforcement (drug/device/food), drug labels, adverse events, + a generic
  openfda_query. Reads optional OPENFDA_API_KEY from env; results trimmed to key fields.
- mcp-servers/openfda/README.md: pip install mcp + claude-mcp-add / .mcp.json registration
- OVERVIEW + README document the new MCP capability (not symlinked — registered once)

Co-Authored-By: Claude Opus 4.7 (1M context) <noreply@anthropic.com>
</commit_message>
<xml_diff>
--- a/docs/OVERVIEW.docx
+++ b/docs/OVERVIEW.docx
@@ -389,6 +389,78 @@
                 <w:b/>
                 <w:sz w:val="18"/>
               </w:rPr>
+              <w:t>MCP server (tool)</w:t>
+            </w:r>
+          </w:p>
+        </w:tc>
+        <w:tc>
+          <w:tcPr>
+            <w:tcW w:type="dxa" w:w="3528"/>
+          </w:tcPr>
+          <w:p>
+            <w:r/>
+            <w:r>
+              <w:rPr>
+                <w:sz w:val="18"/>
+              </w:rPr>
+              <w:t xml:space="preserve">Real executable </w:t>
+            </w:r>
+            <w:r>
+              <w:rPr>
+                <w:b/>
+                <w:sz w:val="18"/>
+              </w:rPr>
+              <w:t>tools</w:t>
+            </w:r>
+            <w:r>
+              <w:rPr>
+                <w:sz w:val="18"/>
+              </w:rPr>
+              <w:t xml:space="preserve"> that reach external systems (APIs, databases) — code, not a prompt</w:t>
+            </w:r>
+          </w:p>
+        </w:tc>
+        <w:tc>
+          <w:tcPr>
+            <w:tcW w:type="dxa" w:w="3528"/>
+          </w:tcPr>
+          <w:p>
+            <w:r/>
+            <w:r>
+              <w:rPr>
+                <w:sz w:val="18"/>
+              </w:rPr>
+              <w:t>just ask; Claude calls the tool</w:t>
+            </w:r>
+          </w:p>
+        </w:tc>
+        <w:tc>
+          <w:tcPr>
+            <w:tcW w:type="dxa" w:w="3528"/>
+          </w:tcPr>
+          <w:p>
+            <w:r/>
+            <w:r>
+              <w:rPr>
+                <w:sz w:val="18"/>
+              </w:rPr>
+              <w:t>`openfda` (recalls/labels/events)</w:t>
+            </w:r>
+          </w:p>
+        </w:tc>
+      </w:tr>
+      <w:tr>
+        <w:tc>
+          <w:tcPr>
+            <w:tcW w:type="dxa" w:w="3528"/>
+          </w:tcPr>
+          <w:p>
+            <w:r/>
+            <w:r>
+              <w:rPr>
+                <w:b/>
+                <w:sz w:val="18"/>
+              </w:rPr>
               <w:t>The qualification engine</w:t>
             </w:r>
           </w:p>
@@ -437,6 +509,66 @@
         </w:tc>
       </w:tr>
     </w:tbl>
+    <w:p>
+      <w:r>
+        <w:rPr>
+          <w:b/>
+          <w:sz w:val="20"/>
+        </w:rPr>
+        <w:t>Tools (MCP servers)</w:t>
+      </w:r>
+      <w:r>
+        <w:rPr>
+          <w:sz w:val="20"/>
+        </w:rPr>
+        <w:t xml:space="preserve"> live under `mcp-servers/`. The first is </w:t>
+      </w:r>
+      <w:r>
+        <w:rPr>
+          <w:b/>
+          <w:sz w:val="20"/>
+        </w:rPr>
+        <w:t>openFDA</w:t>
+      </w:r>
+      <w:r>
+        <w:rPr>
+          <w:sz w:val="20"/>
+        </w:rPr>
+        <w:t xml:space="preserve"> — it gives</w:t>
+      </w:r>
+    </w:p>
+    <w:p>
+      <w:r>
+        <w:rPr>
+          <w:sz w:val="20"/>
+        </w:rPr>
+        <w:t>Claude tools to query FDA recalls, drug labels, and adverse-event reports directly. It's</w:t>
+      </w:r>
+    </w:p>
+    <w:p>
+      <w:r>
+        <w:rPr>
+          <w:sz w:val="20"/>
+        </w:rPr>
+        <w:t>opt-in (needs `pip install mcp` and a one-line registration); see</w:t>
+      </w:r>
+    </w:p>
+    <w:p>
+      <w:r>
+        <w:rPr>
+          <w:sz w:val="20"/>
+        </w:rPr>
+        <w:t>`mcp-servers/openfda/README.md`. Unlike commands/skills, an MCP server is a running</w:t>
+      </w:r>
+    </w:p>
+    <w:p>
+      <w:r>
+        <w:rPr>
+          <w:sz w:val="20"/>
+        </w:rPr>
+        <w:t>program, so it isn't symlinked by `install.sh` — you register it once with Claude Code.</w:t>
+      </w:r>
+    </w:p>
     <w:p>
       <w:r>
         <w:rPr>

</xml_diff>

<commit_message>
Release v1.1.0 — qualify command family, self-qualification pack, MCP/logging/packaging
- /qualify split into qualify:build / :requirements / :review (18 commands total)
- Bundle openFDA MCP server in plugin.json (mcpServers, ${CLAUDE_PLUGIN_ROOT})
- Add server-side logging to the openFDA server and the document-protection hook
- Add server_version() MCP tool (runtime version surface)
- Add requirements.txt (pinned deps, Python >=3.10) + pre-flight dependency checks
- Add docs/minimum-configuration.md and PUBLISHING.md
- Reconcile hooks/README.md registration guidance
- Add DRAFT self-qualification IQ/OQ/PQ pack under Qualification/

Co-Authored-By: Claude Opus 4.8 (1M context) <noreply@anthropic.com>
</commit_message>
<xml_diff>
--- a/docs/OVERVIEW.docx
+++ b/docs/OVERVIEW.docx
@@ -619,7 +619,7 @@
         <w:rPr>
           <w:sz w:val="20"/>
         </w:rPr>
-        <w:t xml:space="preserve"> — `/qualify` plus three sub-agents</w:t>
+        <w:t xml:space="preserve"> — the `/qualify:*` commands plus</w:t>
       </w:r>
     </w:p>
     <w:p>
@@ -627,7 +627,23 @@
         <w:rPr>
           <w:sz w:val="20"/>
         </w:rPr>
-        <w:t>that produce an IQ/OQ/PQ pack. Run `/qualify &lt;app&gt;`; see `how-to-qualify.md`.</w:t>
+        <w:t>three sub-agents that produce an IQ/OQ/PQ pack. `/qualify:build &lt;app&gt;` generates it,</w:t>
+      </w:r>
+    </w:p>
+    <w:p>
+      <w:r>
+        <w:rPr>
+          <w:sz w:val="20"/>
+        </w:rPr>
+        <w:t>`/qualify:requirements &lt;app&gt;` authors the URS it traces against when none exists, and</w:t>
+      </w:r>
+    </w:p>
+    <w:p>
+      <w:r>
+        <w:rPr>
+          <w:sz w:val="20"/>
+        </w:rPr>
+        <w:t>`/qualify:review &lt;app&gt;` reports status and plans gap-closure. See `how-to-qualify.md`.</w:t>
       </w:r>
     </w:p>
     <w:p>
@@ -1010,7 +1026,7 @@
         <w:rPr>
           <w:sz w:val="20"/>
         </w:rPr>
-        <w:t xml:space="preserve"> `/qualify &lt;path-to-the-app&gt;` → a draft IQ/OQ/PQ pack in</w:t>
+        <w:t xml:space="preserve"> `/qualify:build &lt;path-to-the-app&gt;` → a draft IQ/OQ/PQ pack in</w:t>
       </w:r>
     </w:p>
     <w:p>
@@ -1018,7 +1034,23 @@
         <w:rPr>
           <w:sz w:val="20"/>
         </w:rPr>
-        <w:t xml:space="preserve">   `&lt;app&gt;/Qualification/`. See </w:t>
+        <w:t xml:space="preserve">   `&lt;app&gt;/Qualification/`. No requirements doc yet? `/qualify:requirements &lt;app&gt;` first</w:t>
+      </w:r>
+    </w:p>
+    <w:p>
+      <w:r>
+        <w:rPr>
+          <w:sz w:val="20"/>
+        </w:rPr>
+        <w:t xml:space="preserve">   (or let build offer it). Already have a pack? `/qualify:review &lt;app&gt;` for status +</w:t>
+      </w:r>
+    </w:p>
+    <w:p>
+      <w:r>
+        <w:rPr>
+          <w:sz w:val="20"/>
+        </w:rPr>
+        <w:t xml:space="preserve">   gap-closure plan. See </w:t>
       </w:r>
       <w:r>
         <w:rPr>
@@ -1150,7 +1182,7 @@
               <w:rPr>
                 <w:sz w:val="18"/>
               </w:rPr>
-              <w:t>How to run `/qualify` on any app — setup, what to tell Claude, every output</w:t>
+              <w:t>How to run the `/qualify:*` commands on any app — setup, what to tell Claude, every output</w:t>
             </w:r>
           </w:p>
         </w:tc>
@@ -1663,93 +1695,6 @@
         <w:t>Commands (you type these)</w:t>
       </w:r>
     </w:p>
-    <w:p>
-      <w:r>
-        <w:rPr>
-          <w:b/>
-          <w:sz w:val="20"/>
-        </w:rPr>
-        <w:t>(top-level)</w:t>
-      </w:r>
-    </w:p>
-    <w:tbl>
-      <w:tblPr>
-        <w:tblStyle w:val="LightGrid-Accent1"/>
-        <w:tblW w:type="auto" w:w="0"/>
-        <w:tblLayout w:type="autofit"/>
-        <w:tblLook w:firstColumn="1" w:firstRow="1" w:lastColumn="0" w:lastRow="0" w:noHBand="0" w:noVBand="1" w:val="04A0"/>
-      </w:tblPr>
-      <w:tblGrid>
-        <w:gridCol w:w="7056"/>
-        <w:gridCol w:w="7056"/>
-      </w:tblGrid>
-      <w:tr>
-        <w:tc>
-          <w:tcPr>
-            <w:tcW w:type="dxa" w:w="7056"/>
-            <w:shd w:val="clear" w:fill="276BB2"/>
-          </w:tcPr>
-          <w:p>
-            <w:r/>
-            <w:r>
-              <w:rPr>
-                <w:b/>
-                <w:color w:val="FFFFFF"/>
-                <w:sz w:val="18"/>
-              </w:rPr>
-              <w:t>Command</w:t>
-            </w:r>
-          </w:p>
-        </w:tc>
-        <w:tc>
-          <w:tcPr>
-            <w:tcW w:type="dxa" w:w="7056"/>
-            <w:shd w:val="clear" w:fill="276BB2"/>
-          </w:tcPr>
-          <w:p>
-            <w:r/>
-            <w:r>
-              <w:rPr>
-                <w:b/>
-                <w:color w:val="FFFFFF"/>
-                <w:sz w:val="18"/>
-              </w:rPr>
-              <w:t>What it does</w:t>
-            </w:r>
-          </w:p>
-        </w:tc>
-      </w:tr>
-      <w:tr>
-        <w:tc>
-          <w:tcPr>
-            <w:tcW w:type="dxa" w:w="7056"/>
-          </w:tcPr>
-          <w:p>
-            <w:r/>
-            <w:r>
-              <w:rPr>
-                <w:sz w:val="18"/>
-              </w:rPr>
-              <w:t>`/qualify`</w:t>
-            </w:r>
-          </w:p>
-        </w:tc>
-        <w:tc>
-          <w:tcPr>
-            <w:tcW w:type="dxa" w:w="7056"/>
-          </w:tcPr>
-          <w:p>
-            <w:r/>
-            <w:r>
-              <w:rPr>
-                <w:sz w:val="18"/>
-              </w:rPr>
-              <w:t>Build (or verify) an IQ/OQ/PQ qualification package for a system by fanning out to the xQ specialist subagents in parallel</w:t>
-            </w:r>
-          </w:p>
-        </w:tc>
-      </w:tr>
-    </w:tbl>
     <w:p>
       <w:r>
         <w:rPr>
@@ -2486,6 +2431,153 @@
       </w:tr>
     </w:tbl>
     <w:p>
+      <w:r>
+        <w:rPr>
+          <w:b/>
+          <w:sz w:val="20"/>
+        </w:rPr>
+        <w:t>qualify</w:t>
+      </w:r>
+    </w:p>
+    <w:tbl>
+      <w:tblPr>
+        <w:tblStyle w:val="LightGrid-Accent1"/>
+        <w:tblW w:type="auto" w:w="0"/>
+        <w:tblLayout w:type="autofit"/>
+        <w:tblLook w:firstColumn="1" w:firstRow="1" w:lastColumn="0" w:lastRow="0" w:noHBand="0" w:noVBand="1" w:val="04A0"/>
+      </w:tblPr>
+      <w:tblGrid>
+        <w:gridCol w:w="7056"/>
+        <w:gridCol w:w="7056"/>
+      </w:tblGrid>
+      <w:tr>
+        <w:tc>
+          <w:tcPr>
+            <w:tcW w:type="dxa" w:w="7056"/>
+            <w:shd w:val="clear" w:fill="276BB2"/>
+          </w:tcPr>
+          <w:p>
+            <w:r/>
+            <w:r>
+              <w:rPr>
+                <w:b/>
+                <w:color w:val="FFFFFF"/>
+                <w:sz w:val="18"/>
+              </w:rPr>
+              <w:t>Command</w:t>
+            </w:r>
+          </w:p>
+        </w:tc>
+        <w:tc>
+          <w:tcPr>
+            <w:tcW w:type="dxa" w:w="7056"/>
+            <w:shd w:val="clear" w:fill="276BB2"/>
+          </w:tcPr>
+          <w:p>
+            <w:r/>
+            <w:r>
+              <w:rPr>
+                <w:b/>
+                <w:color w:val="FFFFFF"/>
+                <w:sz w:val="18"/>
+              </w:rPr>
+              <w:t>What it does</w:t>
+            </w:r>
+          </w:p>
+        </w:tc>
+      </w:tr>
+      <w:tr>
+        <w:tc>
+          <w:tcPr>
+            <w:tcW w:type="dxa" w:w="7056"/>
+          </w:tcPr>
+          <w:p>
+            <w:r/>
+            <w:r>
+              <w:rPr>
+                <w:sz w:val="18"/>
+              </w:rPr>
+              <w:t>`/qualify:build`</w:t>
+            </w:r>
+          </w:p>
+        </w:tc>
+        <w:tc>
+          <w:tcPr>
+            <w:tcW w:type="dxa" w:w="7056"/>
+          </w:tcPr>
+          <w:p>
+            <w:r/>
+            <w:r>
+              <w:rPr>
+                <w:sz w:val="18"/>
+              </w:rPr>
+              <w:t>Build a draft IQ/OQ/PQ qualification pack for a system — discover the stack, database schema(s), required seed data, and the approved requirements, then fan out to the xQ specialist subagents in parallel</w:t>
+            </w:r>
+          </w:p>
+        </w:tc>
+      </w:tr>
+      <w:tr>
+        <w:tc>
+          <w:tcPr>
+            <w:tcW w:type="dxa" w:w="7056"/>
+          </w:tcPr>
+          <w:p>
+            <w:r/>
+            <w:r>
+              <w:rPr>
+                <w:sz w:val="18"/>
+              </w:rPr>
+              <w:t>`/qualify:requirements`</w:t>
+            </w:r>
+          </w:p>
+        </w:tc>
+        <w:tc>
+          <w:tcPr>
+            <w:tcW w:type="dxa" w:w="7056"/>
+          </w:tcPr>
+          <w:p>
+            <w:r/>
+            <w:r>
+              <w:rPr>
+                <w:sz w:val="18"/>
+              </w:rPr>
+              <w:t>Author a draft User Requirements Specification (URS) for a system when none exists — discharging the regulatory obligation to define requirements before qualification, structured so each requirement is testable and feeds PQ traceability</w:t>
+            </w:r>
+          </w:p>
+        </w:tc>
+      </w:tr>
+      <w:tr>
+        <w:tc>
+          <w:tcPr>
+            <w:tcW w:type="dxa" w:w="7056"/>
+          </w:tcPr>
+          <w:p>
+            <w:r/>
+            <w:r>
+              <w:rPr>
+                <w:sz w:val="18"/>
+              </w:rPr>
+              <w:t>`/qualify:review`</w:t>
+            </w:r>
+          </w:p>
+        </w:tc>
+        <w:tc>
+          <w:tcPr>
+            <w:tcW w:type="dxa" w:w="7056"/>
+          </w:tcPr>
+          <w:p>
+            <w:r/>
+            <w:r>
+              <w:rPr>
+                <w:sz w:val="18"/>
+              </w:rPr>
+              <w:t>Review an existing qualification pack — report what is complete and where gaps remain, detect drift against the current system, and produce a plan to close the gaps an AI can close</w:t>
+            </w:r>
+          </w:p>
+        </w:tc>
+      </w:tr>
+    </w:tbl>
+    <w:p>
       <w:pPr>
         <w:keepNext/>
         <w:spacing w:before="160" w:after="80"/>
@@ -2618,7 +2710,7 @@
           <w:color w:val="276BB2"/>
           <w:sz w:val="24"/>
         </w:rPr>
-        <w:t>Sub-agents (run in parallel by `/qualify`)</w:t>
+        <w:t>Sub-agents (run in parallel by `/qualify:build` and `/qualify:review`)</w:t>
       </w:r>
     </w:p>
     <w:tbl>
@@ -2693,7 +2785,7 @@
               <w:rPr>
                 <w:sz w:val="18"/>
               </w:rPr>
-              <w:t>Installation Qualification (IQ) specialist. Use to examine a system's TECH STACK and installed/configured state and produce IQ evidence — or, in verify mode, to pre-check IQ items in an existing qualification pack against what's actually present. Delegated to by the /qualify orchestrator, typically in parallel with oq-qualifier and pq-qualifier.</w:t>
+              <w:t>Installation Qualification (IQ) specialist. Use to examine a system's TECH STACK and installed/configured state and produce IQ evidence — or, in verify mode, to pre-check IQ items in an existing qualification pack against what's actually present. Delegated to by /qualify:build (generate) and /qualify:review (verify), typically in parallel with oq-qualifier and pq-qualifier.</w:t>
             </w:r>
           </w:p>
         </w:tc>
@@ -2723,7 +2815,7 @@
               <w:rPr>
                 <w:sz w:val="18"/>
               </w:rPr>
-              <w:t>Operational Qualification (OQ) specialist. Use to examine HOW a system has been built — its functions, configuration logic, build pipeline, and tests — and produce OQ evidence that it operates per specification; or, in verify mode, pre-check OQ items in an existing pack. Delegated to by /qualify, usually in parallel with iq-qualifier and pq-qualifier.</w:t>
+              <w:t>Operational Qualification (OQ) specialist. Use to examine HOW a system has been built — its functions, configuration logic, build pipeline, and tests — and produce OQ evidence that it operates per specification; or, in verify mode, pre-check OQ items in an existing pack. Delegated to by /qualify:build (generate) and /qualify:review (verify), usually in parallel with iq-qualifier and pq-qualifier.</w:t>
             </w:r>
           </w:p>
         </w:tc>
@@ -2753,7 +2845,7 @@
               <w:rPr>
                 <w:sz w:val="18"/>
               </w:rPr>
-              <w:t>Performance Qualification (PQ) specialist. Use to verify a system DOES WHAT IT IS SUPPOSED TO in its intended use — requirements vs. actual behaviour, end-to-end workflows, representative data — and produce PQ evidence; or, in verify mode, pre-check PQ items in an existing pack. Delegated to by /qualify, usually in parallel with iq-qualifier and oq-qualifier.</w:t>
+              <w:t>Performance Qualification (PQ) specialist. Use to verify a system DOES WHAT IT IS SUPPOSED TO in its intended use — requirements vs. actual behaviour, end-to-end workflows, representative data — and produce PQ evidence; or, in verify mode, pre-check PQ items in an existing pack. Delegated to by /qualify:build (generate) and /qualify:review (verify), usually in parallel with iq-qualifier and oq-qualifier.</w:t>
             </w:r>
           </w:p>
         </w:tc>

</xml_diff>